<commit_message>
feat(livrables): rebuild L1/L2/L3 depuis sources reconciliees + figR3-qdi.png regeneree (STOP deck verifie, chiffres sanctuarises intacts)
</commit_message>
<xml_diff>
--- a/book/livrable1-explication.docx
+++ b/book/livrable1-explication.docx
@@ -475,7 +475,7 @@
           <w:sz w:val="24"/>
           <w:szCs w:val="24"/>
         </w:rPr>
-        <w:t xml:space="preserve">Chaque essai rejoue l'un des quatre profils retenus. P1 représente la fibre du siège : 80 mégabits par seconde, 20 millisecondes d'aller-retour, sans perte. P2 représente la 4G de Yas, le cas d'étude central : 20 mégabits, 100 millisecondes, 0,5 pour cent de perte. P3 représente le VSAT des stations isolées : 5 mégabits et surtout 600 millisecondes, l'aller-retour imposé par un satellite géostationnaire placé à 36 000 kilomètres. P4, ajouté en fin de travail, représente Starlink : 100 mégabits, 40 millisecondes, avec une gigue marquée propre aux relais entre satellites en orbite basse.</w:t>
+        <w:t xml:space="preserve">Chaque essai rejoue l'un des quatre profils retenus. P1 représente la fibre du siège : 80 mégabits par seconde, 20 millisecondes d'aller-retour, gigue de 2 millisecondes, sans perte. P2 représente la 4G de Yas, le cas d'étude central : 20 mégabits, 100 millisecondes, gigue de 15 millisecondes, 0,5 pour cent de perte. P3 représente le VSAT des stations isolées : 5 mégabits et surtout 600 millisecondes, l'aller-retour imposé par un satellite géostationnaire placé à 36 000 kilomètres, gigue de 30 millisecondes, 1 pour cent de perte. P4, ajouté en fin de travail, représente Starlink : 100 mégabits, 40 millisecondes, gigue de 20 millisecondes et 0,3 pour cent de perte, avec une gigue marquée propre aux relais entre satellites en orbite basse.</w:t>
       </w:r>
     </w:p>
     <w:p>
@@ -509,7 +509,7 @@
           <w:sz w:val="24"/>
           <w:szCs w:val="24"/>
         </w:rPr>
-        <w:t xml:space="preserve">Chaque événement d'essai suit le même déroulement : trente secondes de calme pour mesurer l'état de repos, cent vingt secondes de charge pendant lesquelles un flux massif sature le lien, puis trente secondes de récupération. Huit portes de qualité, numérotées de zéro à sept, vérifient chaque événement : la cible répond-elle, la charge a-t-elle vraiment démarré, les sondes produisent-elles, la latence est-elle physiquement plausible, le débit cohérent, aucune ligne dupliquée, la mesure de repos stable, la machine pas saturée. Un événement qui échoue une porte majeure est mis en quarantaine : sa ligne est conservée mais exclue des résultats. Rien n'est caché, tout est compté.</w:t>
+        <w:t xml:space="preserve">Chaque événement d'essai suit le même déroulement : trente secondes de calme pour mesurer l'état de repos, cent vingt secondes de charge pendant lesquelles un flux massif sature le lien, puis trente secondes de récupération. Huit portes de qualité, numérotées de zéro à sept, vérifient chaque événement : la cible répond-elle, la charge a-t-elle vraiment démarré, les sondes produisent-elles, la latence est-elle physiquement plausible, le débit cohérent, aucune ligne dupliquée, la mesure de repos stable, la machine pas saturée. Un événement qui échoue une porte majeure est marqué invalid, mis en quarantaine : sa ligne est conservée mais exclue des médianes ; un événement partiellement réussi est marqué degraded et reste exploité. Rien n'est caché, tout est compté.</w:t>
       </w:r>
     </w:p>
     <w:p>
@@ -577,7 +577,7 @@
           <w:sz w:val="26"/>
           <w:szCs w:val="26"/>
         </w:rPr>
-        <w:t xml:space="preserve">Cinq indicateurs, chacun répond à une question</w:t>
+        <w:t xml:space="preserve">Six indicateurs, chacun répond à une question</w:t>
       </w:r>
     </w:p>
     <w:p>
@@ -649,7 +649,7 @@
           <w:sz w:val="24"/>
           <w:szCs w:val="24"/>
         </w:rPr>
-        <w:t xml:space="preserve">Sur la voix, le score R confirme la hiérarchie : 92,9 sur le profil fibre au repos, 92,1 sur Starlink, 71,5 sur le VSAT. Le coût, calculé au palier mensuel de 4,5 gigaoctets, rend le gaspillage sensible : quelques centaines d'ariary par heure de charge sur un lien 4G, la fibre étant dix fois moins chère au gigaoctet.</w:t>
+        <w:t xml:space="preserve">Sur la voix, le score R confirme la hiérarchie : 92,9 sur le profil fibre au repos, 92,1 sur Starlink, 91,4 sur le cellulaire, 71,5 sur le VSAT. Le coût, calculé au palier choisi (six forfaits réels, défaut mensuel de 4,5 gigaoctets), rend le gaspillage sensible : quelques centaines d'ariary par heure de charge sur un lien 4G, la fibre étant dix fois moins chère au gigaoctet.</w:t>
       </w:r>
     </w:p>
     <w:p>
@@ -1083,41 +1083,41 @@
           <w:sz w:val="24"/>
           <w:szCs w:val="24"/>
         </w:rPr>
-        <w:t xml:space="preserve">Les 134 runs sont horodatés par leur identifiant même : run-1788191429 commence par un horodatage Unix. La machine du banc : machine virtuelle Ubuntu, deux processeurs virtuels, et chaque événement porte sa colonne d'utilisation processeur, zéro pour cent sur les six événements du run final : la machine n'a pas influé. Réinstaller le banc et relancer la même campagne redonnerait des conditions identiques, c'est l'objet du banc.</w:t>
-      </w:r>
-    </w:p>
-    <w:p>
-      <w:pPr>
-        <w:spacing w:after="140" w:before="240" w:line="360"/>
-      </w:pPr>
-      <w:r>
-        <w:rPr>
-          <w:rFonts w:ascii="Times New Roman" w:cs="Times New Roman" w:eastAsia="Times New Roman" w:hAnsi="Times New Roman"/>
-          <w:b/>
-          <w:bCs/>
-          <w:sz w:val="26"/>
-          <w:szCs w:val="26"/>
-        </w:rPr>
-        <w:t xml:space="preserve">154 quarantaines pour 83 valides : pourquoi vous croire ?</w:t>
-      </w:r>
-    </w:p>
-    <w:p>
-      <w:pPr>
-        <w:spacing w:after="120" w:line="360"/>
-        <w:ind w:firstLine="709"/>
-        <w:jc w:val="both"/>
-      </w:pPr>
-      <w:r>
-        <w:rPr>
-          <w:rFonts w:ascii="Times New Roman" w:cs="Times New Roman" w:eastAsia="Times New Roman" w:hAnsi="Times New Roman"/>
-          <w:b w:val="false"/>
-          <w:bCs w:val="false"/>
-          <w:i w:val="false"/>
-          <w:iCs w:val="false"/>
-          <w:sz w:val="24"/>
-          <w:szCs w:val="24"/>
-        </w:rPr>
-        <w:t xml:space="preserve">Le ratio assume un choix : des portes larges auraient rempli les archives et affaibli les conclusions. Ce qui est en quarantaine : surtout les vagues de mise au point, où chaque durcissement d'une porte rejetait en bloc les événements antérieurs, et les cellules dont le régime de charge ne s'établissait pas. Ce que ça n'affecte pas : les 83 lignes valides, dont chacune a passé les huit contrôles. Le compte est publié, la quarantaine est conservée à côté des valides, et le lecteur peut reconstituer le filtre.</w:t>
+        <w:t xml:space="preserve">Les 153 runs sont horodatés par leur identifiant même : run-1788191429 commence par un horodatage Unix. La machine du banc : machine virtuelle Ubuntu, deux processeurs virtuels, et chaque événement porte sa colonne d'utilisation processeur, zéro pour cent sur les six événements du run final : la machine n'a pas influé. Réinstaller le banc et relancer la même campagne redonnerait des conditions identiques, c'est l'objet du banc.</w:t>
+      </w:r>
+    </w:p>
+    <w:p>
+      <w:pPr>
+        <w:spacing w:after="140" w:before="240" w:line="360"/>
+      </w:pPr>
+      <w:r>
+        <w:rPr>
+          <w:rFonts w:ascii="Times New Roman" w:cs="Times New Roman" w:eastAsia="Times New Roman" w:hAnsi="Times New Roman"/>
+          <w:b/>
+          <w:bCs/>
+          <w:sz w:val="26"/>
+          <w:szCs w:val="26"/>
+        </w:rPr>
+        <w:t xml:space="preserve">214 quarantaines pour 136 valides : pourquoi vous croire ?</w:t>
+      </w:r>
+    </w:p>
+    <w:p>
+      <w:pPr>
+        <w:spacing w:after="120" w:line="360"/>
+        <w:ind w:firstLine="709"/>
+        <w:jc w:val="both"/>
+      </w:pPr>
+      <w:r>
+        <w:rPr>
+          <w:rFonts w:ascii="Times New Roman" w:cs="Times New Roman" w:eastAsia="Times New Roman" w:hAnsi="Times New Roman"/>
+          <w:b w:val="false"/>
+          <w:bCs w:val="false"/>
+          <w:i w:val="false"/>
+          <w:iCs w:val="false"/>
+          <w:sz w:val="24"/>
+          <w:szCs w:val="24"/>
+        </w:rPr>
+        <w:t xml:space="preserve">Le ratio assume un choix : des portes larges auraient rempli les archives et affaibli les conclusions. Ce qui est en quarantaine : surtout les vagues de mise au point, où chaque durcissement d'une porte rejetait en bloc les événements antérieurs, et les cellules dont le régime de charge ne s'établissait pas. Ce que ça n'affecte pas : les 136 lignes valides, dont chacune a passé les huit contrôles. Le compte est publié, la quarantaine est conservée à côté des valides, et le lecteur peut reconstituer le filtre.</w:t>
       </w:r>
     </w:p>
     <w:p>
@@ -1151,7 +1151,7 @@
           <w:sz w:val="24"/>
           <w:szCs w:val="24"/>
         </w:rPr>
-        <w:t xml:space="preserve">D'abord nommer : la campagne finale conduit une répétition par cellule. Borner : n égale un interdit les comparaisons fines entre disciplines voisines ; il n'interdit pas les ordres de grandeur quand l'effet est massif : soixante contre quatre-vingt-dix-huit pour cent d'échéances, ce n'est pas un écart de bruit. Mitiger : les vagues antérieures comptent des répétitions, onze pour la file simple sous BBR sur le profil 4G, sept pour fq_codel, six pour CAKE, cinquante-et-une pour la cellule CUBIC de la fibre, et la fenêtre de charge elle-même agrège environ cent vingt observations de sondes : le p95 ne repose pas sur un point. Refermer : conclusions exploratoires sur les cellules à événement unique, consolidation par trois répétitions systématiques en premier travail futur.</w:t>
+        <w:t xml:space="preserve">D'abord nommer : la campagne finale conduit une répétition par cellule. Borner : n égale un interdit les comparaisons fines entre disciplines voisines ; il n'interdit pas les ordres de grandeur quand l'effet est massif : soixante contre quatre-vingt-dix-huit pour cent d'échéances, ce n'est pas un écart de bruit. Mitiger : les vagues antérieures comptent des répétitions, seize pour la file simple sous BBR sur le profil 4G, douze pour fq_codel, douze pour CAKE, cinquante-cinq pour la cellule CUBIC de la fibre, et la fenêtre de charge elle-même agrège environ cent vingt observations de sondes : le p95 ne repose pas sur un point. Refermer : conclusions exploratoires sur les cellules à événement unique, consolidation par trois répétitions systématiques en premier travail futur.</w:t>
       </w:r>
     </w:p>
     <w:p>
@@ -1200,26 +1200,26 @@
           <w:sz w:val="26"/>
           <w:szCs w:val="26"/>
         </w:rPr>
-        <w:t xml:space="preserve">Le VSAT P3 : aucune cellule valide. Vous cachez un échec ?</w:t>
-      </w:r>
-    </w:p>
-    <w:p>
-      <w:pPr>
-        <w:spacing w:after="120" w:line="360"/>
-        <w:ind w:firstLine="709"/>
-        <w:jc w:val="both"/>
-      </w:pPr>
-      <w:r>
-        <w:rPr>
-          <w:rFonts w:ascii="Times New Roman" w:cs="Times New Roman" w:eastAsia="Times New Roman" w:hAnsi="Times New Roman"/>
-          <w:b w:val="false"/>
-          <w:bCs w:val="false"/>
-          <w:i w:val="false"/>
-          <w:iCs w:val="false"/>
-          <w:sz w:val="24"/>
-          <w:szCs w:val="24"/>
-        </w:rPr>
-        <w:t xml:space="preserve">L'assumer avant qu'il soit trouvé : aucune cellule valide sur le profil P3. Un flux soutenu à cinq mégabits devant six cents millisecondes d'aller-retour ne tient pas la porte du débit cohérent ; aucune combinaison testée n'y est parvenue. Le résultat est double : la stricte application des portes exclut ce profil, et la physique du satellite géostationnaire place le plancher de latence hors de portée de toute configuration. Le mémoire le publie tel quel, c'est une borne du dispositif, pas un angle mort.</w:t>
+        <w:t xml:space="preserve">Le VSAT P3 : neuf lignes valides à échéance nulle. Que conclure ?</w:t>
+      </w:r>
+    </w:p>
+    <w:p>
+      <w:pPr>
+        <w:spacing w:after="120" w:line="360"/>
+        <w:ind w:firstLine="709"/>
+        <w:jc w:val="both"/>
+      </w:pPr>
+      <w:r>
+        <w:rPr>
+          <w:rFonts w:ascii="Times New Roman" w:cs="Times New Roman" w:eastAsia="Times New Roman" w:hAnsi="Times New Roman"/>
+          <w:b w:val="false"/>
+          <w:bCs w:val="false"/>
+          <w:i w:val="false"/>
+          <w:iCs w:val="false"/>
+          <w:sz w:val="24"/>
+          <w:szCs w:val="24"/>
+        </w:rPr>
+        <w:t xml:space="preserve">L'assumer avant qu'il soit trouvé : neuf lignes valides sur le profil P3, trois par cellule sous BBR, toutes à échéance nulle. Un flux soutenu à cinq mégabits devant six cents millisecondes d'aller-retour ne tient pas la porte du débit cohérent ; les disciplines actives y passent les portes mais n'ouvrent aucune fenêtre de latence utile. Le résultat est double : la stricte application des portes confirme la thèse par la mesure, et la physique du satellite géostationnaire place le plancher de latence hors de portée de toute configuration. Le mémoire le publie tel quel, c'est une borne du dispositif, pas un angle mort.</w:t>
       </w:r>
     </w:p>
     <w:p>
@@ -1287,7 +1287,7 @@
           <w:sz w:val="24"/>
           <w:szCs w:val="24"/>
         </w:rPr>
-        <w:t xml:space="preserve">Deux raisons, assumées : laisser à CUBIC le temps d'atteindre son régime établi, qui met plusieurs dizaines de secondes à monter sur un lien à cent millisecondes d'aller-retour ; et borner le volume consommé par campagne, ce que le contexte prépayé impose. Le standard de la communauté fait cinq plus soixante plus cinq secondes : la fenêtre retenue couvre le régime établi des deux contrôles testés, et la répétition des événements compense ce qu'elle ne couvre pas des effets prolongés. La saturation d'une journée entière reste une limite nommée.</w:t>
+        <w:t xml:space="preserve">Deux raisons, assumées : laisser à CUBIC le temps d'atteindre son régime établi, qui met plusieurs dizaines de secondes à monter sur un lien à cent millisecondes d'aller-retour ; et borner le volume consommé par campagne, ce que le contexte prépayé impose. Le standard de la communauté fait cinq plus soixante plus cinq secondes : la fenêtre retenue couvre le régime établi des deux contrôles testés, et la répétition des événements compense ce qu'elle ne couvre pas des effets prolongés. La saturation d'une journée entière reste une limite nommée. Le sens download se mesure en miroir (shaper côté serveur), et le mode both enchaîne montée puis descente en RRUL séquentiel.</w:t>
       </w:r>
     </w:p>
     <w:p>
@@ -1321,7 +1321,7 @@
           <w:sz w:val="24"/>
           <w:szCs w:val="24"/>
         </w:rPr>
-        <w:t xml:space="preserve">Sur les cellules à répétitions multiples, l'écart médiane contre p95 des p95 existe et est publié : la cellule CUBIC de la fibre tient une médiane de p95 à cinquante-cinq millisecondes et un p95 des p95 à sept cent quarante-six : la dispersion est visible, pas cachée. Sur les cellules à événement unique, n égale un interdit le test de dispersion : c'est la limite nommée, et la première perspective la lève. Ce que l'écart massif soixante contre quatre-vingt-dix-huit pour cent ne risque pas : un chevauchement de bruit.</w:t>
+        <w:t xml:space="preserve">Sur les cellules à répétitions multiples, l'écart médiane contre p95 des p95 existe et est publié : la cellule CUBIC de la fibre tient une médiane de p95 à soixante millisecondes et un p95 des p95 à sept cent soixante-trois : la dispersion est visible, pas cachée. Sur les cellules à événement unique, n égale un interdit le test de dispersion : c'est la limite nommée, et la première perspective la lève. Ce que l'écart massif soixante contre quatre-vingt-dix-huit pour cent ne risque pas : un chevauchement de bruit.</w:t>
       </w:r>
     </w:p>
     <w:p>
@@ -1729,7 +1729,7 @@
           <w:sz w:val="24"/>
           <w:szCs w:val="24"/>
         </w:rPr>
-        <w:t xml:space="preserve">Juste : le profil P4 tient une capacité fixe et une gigue propre aux relais, pas la variation continue de débit minute par minute des liens cellulaires et orbitaux réels. Ce que le banc en dit : la latence de base passe de six cents à quarante millisecondes, la difficulté se déplace du délai vers la gigue, et la discipline active garde prise sur la gigue de file, pas sur celle de la constellation. La variation continue de capacité est une limite nommée, et l'adaptation de débit en continu relève des travaux qui existent dans la communauté : c'est une perspective, pas un acquis.</w:t>
+        <w:t xml:space="preserve">Juste : le profil P4 tient une capacité fixe et une gigue propre aux relais, pas la variation continue de débit minute par minute des liens cellulaires et orbitaux réels. Les pertes en rafales, elles, sont modélisées (Gilbert-Elliott). Ce que le banc en dit : la latence de base passe de six cents à quarante millisecondes, la difficulté se déplace du délai vers la gigue, et la discipline active garde prise sur la gigue de file, pas sur celle de la constellation. La variation continue de capacité est une limite nommée, et l'adaptation de débit en continu relève des travaux qui existent dans la communauté : c'est une perspective, pas un acquis.</w:t>
       </w:r>
     </w:p>
     <w:p>
@@ -1763,7 +1763,7 @@
           <w:sz w:val="24"/>
           <w:szCs w:val="24"/>
         </w:rPr>
-        <w:t xml:space="preserve">L'effondrement de CUBIC sur le profil cellulaire : trois cellules mises en quarantaine, non pour leur latence, excellente, mais parce que le contrôle fondé sur la perte interprète la perte de base du lien comme une congestion, réduit sa fenêtre et ne tient plus la charge. Le résultat détourné devient un enseignement : sur un lien cellulaire à perte de base, le choix du contrôle de congestion décide autant que la discipline de file.</w:t>
+        <w:t xml:space="preserve">L'effondrement de CUBIC sur le profil cellulaire : trois cellules marquées invalid, non pour leur latence, excellente, mais parce que le contrôle fondé sur la perte interprète la perte de base du lien comme une congestion, réduit sa fenêtre et ne tient plus la charge. Le résultat détourné devient un enseignement : sur un lien cellulaire à perte de base, le choix du contrôle de congestion décide autant que la discipline de file.</w:t>
       </w:r>
     </w:p>
     <w:p>

</xml_diff>

<commit_message>
feat(livrables): placeholders jaunes + titre + resume sans chiffres + serveur reel + kit toute-machine + QA progressive + cleanup repo
</commit_message>
<xml_diff>
--- a/book/livrable1-explication.docx
+++ b/book/livrable1-explication.docx
@@ -928,7 +928,7 @@
           <w:sz w:val="24"/>
           <w:szCs w:val="24"/>
         </w:rPr>
-        <w:t xml:space="preserve">Comment utiliser ce kit : chaque réponse suit le même squelette en quatre temps. Nommer la limite sans l'adoucir. Borner : ce qu'elle affecte, ce qu'elle n'affecte pas. Mitiger : ce qui est fait malgré elle. Refermer : la portée exacte de l'affirmation. Chaque réponse tient en moins d'une minute et porte au moins un chiffre exact des archives.</w:t>
+        <w:t xml:space="preserve">Comment utiliser ce kit : les questions suivent un ordre progressif, du plus simple au plus profond — ce qu'est le projet, à quoi il sert, ce qu'il prouve, comment il mesure, puis les classiques du jury. Chaque réponse suit le même squelette en quatre temps. Nommer la limite sans l'adoucir. Borner : ce qu'elle affecte, ce qu'elle n'affecte pas. Mitiger : ce qui est fait malgré elle. Refermer : la portée exacte de l'affirmation. Chaque réponse tient en moins d'une minute et porte au moins un chiffre exact des archives.</w:t>
       </w:r>
     </w:p>
     <w:p>
@@ -996,6 +996,346 @@
           <w:sz w:val="26"/>
           <w:szCs w:val="26"/>
         </w:rPr>
+        <w:t xml:space="preserve">C'est quoi, ce projet, au juste ?</w:t>
+      </w:r>
+    </w:p>
+    <w:p>
+      <w:pPr>
+        <w:spacing w:after="120" w:line="360"/>
+        <w:ind w:firstLine="709"/>
+        <w:jc w:val="both"/>
+      </w:pPr>
+      <w:r>
+        <w:rPr>
+          <w:rFonts w:ascii="Times New Roman" w:cs="Times New Roman" w:eastAsia="Times New Roman" w:hAnsi="Times New Roman"/>
+          <w:b w:val="false"/>
+          <w:bCs w:val="false"/>
+          <w:i w:val="false"/>
+          <w:iCs w:val="false"/>
+          <w:sz w:val="24"/>
+          <w:szCs w:val="24"/>
+        </w:rPr>
+        <w:t xml:space="preserve">Un instrument qui répond à une question simple : quand un gros téléchargement sature notre lien, nos petites requêtes urgentes attendent-elles derrière lui, et que faut-il régler pour qu'elles passent ? L'instrument mesure, compare les réglages possibles à conditions identiques, et archive chaque mesure avec une preuve qu'on peut revérifier. Deux moitiés : un audit, qui mesure un lien réel sans rien y toucher ; un banc, qui rejoue quatre types de liens et teste trois disciplines de file contre deux émetteurs. Le tout tient dans un seul fichier, sans installation.</w:t>
+      </w:r>
+    </w:p>
+    <w:p>
+      <w:pPr>
+        <w:spacing w:after="140" w:before="240" w:line="360"/>
+      </w:pPr>
+      <w:r>
+        <w:rPr>
+          <w:rFonts w:ascii="Times New Roman" w:cs="Times New Roman" w:eastAsia="Times New Roman" w:hAnsi="Times New Roman"/>
+          <w:b/>
+          <w:bCs/>
+          <w:sz w:val="26"/>
+          <w:szCs w:val="26"/>
+        </w:rPr>
+        <w:t xml:space="preserve">Rappelle-moi ta méthodologie, simplement.</w:t>
+      </w:r>
+    </w:p>
+    <w:p>
+      <w:pPr>
+        <w:spacing w:after="120" w:line="360"/>
+        <w:ind w:firstLine="709"/>
+        <w:jc w:val="both"/>
+      </w:pPr>
+      <w:r>
+        <w:rPr>
+          <w:rFonts w:ascii="Times New Roman" w:cs="Times New Roman" w:eastAsia="Times New Roman" w:hAnsi="Times New Roman"/>
+          <w:b w:val="false"/>
+          <w:bCs w:val="false"/>
+          <w:i w:val="false"/>
+          <w:iCs w:val="false"/>
+          <w:sz w:val="24"/>
+          <w:szCs w:val="24"/>
+        </w:rPr>
+        <w:t xml:space="preserve">Trois gestes, toujours dans cet ordre. D'abord auditer : mesurer le lien réel, au repos puis sous une courte charge, pour savoir ce que subissent les utilisateurs aujourd'hui. Ensuite comparer : rejouer ce lien sur le banc et tester chaque réglage aux mêmes conditions, avec huit contrôles automatiques qui rejettent toute mesure douteuse. Enfin prescrire : transformer l'écart mesuré en une ligne de configuration, l'appliquer, et re-mesurer pour vérifier. Mesurer, comparer, appliquer, re-mesurer : si une étape manque, on ne recommande rien.</w:t>
+      </w:r>
+    </w:p>
+    <w:p>
+      <w:pPr>
+        <w:spacing w:after="140" w:before="240" w:line="360"/>
+      </w:pPr>
+      <w:r>
+        <w:rPr>
+          <w:rFonts w:ascii="Times New Roman" w:cs="Times New Roman" w:eastAsia="Times New Roman" w:hAnsi="Times New Roman"/>
+          <w:b/>
+          <w:bCs/>
+          <w:sz w:val="26"/>
+          <w:szCs w:val="26"/>
+        </w:rPr>
+        <w:t xml:space="preserve">Pourquoi ces métriques-là, et pas d'autres ?</w:t>
+      </w:r>
+    </w:p>
+    <w:p>
+      <w:pPr>
+        <w:spacing w:after="120" w:line="360"/>
+        <w:ind w:firstLine="709"/>
+        <w:jc w:val="both"/>
+      </w:pPr>
+      <w:r>
+        <w:rPr>
+          <w:rFonts w:ascii="Times New Roman" w:cs="Times New Roman" w:eastAsia="Times New Roman" w:hAnsi="Times New Roman"/>
+          <w:b w:val="false"/>
+          <w:bCs w:val="false"/>
+          <w:i w:val="false"/>
+          <w:iCs w:val="false"/>
+          <w:sz w:val="24"/>
+          <w:szCs w:val="24"/>
+        </w:rPr>
+        <w:t xml:space="preserve">Chacune répond à une question de quelqu'un. La médiane et le p95 : ce que vivent les requêtes, typiques et malchanceuses — la moyenne noierait les secondes qui comptent. Le respect d'échéance : la langue de l'exploitation, un engagement vérifiable plutôt qu'une statistique. Le QDI : la régularité, sans laquelle aucune alerte automatique n'est possible. Le score de voix : ce qu'entendrait un appel sur ce lien. Le coût en ariary : ce que paie la direction, au palier réellement souscrit. Six métriques, six lecteurs : le technicien, l'exploitant, le superviseur, l'usager voix, le financier. Aucune n'est décorative.</w:t>
+      </w:r>
+    </w:p>
+    <w:p>
+      <w:pPr>
+        <w:spacing w:after="140" w:before="240" w:line="360"/>
+      </w:pPr>
+      <w:r>
+        <w:rPr>
+          <w:rFonts w:ascii="Times New Roman" w:cs="Times New Roman" w:eastAsia="Times New Roman" w:hAnsi="Times New Roman"/>
+          <w:b/>
+          <w:bCs/>
+          <w:sz w:val="26"/>
+          <w:szCs w:val="26"/>
+        </w:rPr>
+        <w:t xml:space="preserve">Quelle est ta problématique exacte ?</w:t>
+      </w:r>
+    </w:p>
+    <w:p>
+      <w:pPr>
+        <w:spacing w:after="120" w:line="360"/>
+        <w:ind w:firstLine="709"/>
+        <w:jc w:val="both"/>
+      </w:pPr>
+      <w:r>
+        <w:rPr>
+          <w:rFonts w:ascii="Times New Roman" w:cs="Times New Roman" w:eastAsia="Times New Roman" w:hAnsi="Times New Roman"/>
+          <w:b w:val="false"/>
+          <w:bCs w:val="false"/>
+          <w:i w:val="false"/>
+          <w:iCs w:val="false"/>
+          <w:sz w:val="24"/>
+          <w:szCs w:val="24"/>
+        </w:rPr>
+        <w:t xml:space="preserve">À conditions de lien identiques, comment le choix de la discipline de file affecte-t-il la latence des petites requêtes, et ce effet dépend-il de l'émetteur ? Puis : l'avantage tient-il sur les liens dégradés, et quel levier concret recommander, avec quelle confiance mesurée ? Quatre questions, QR1 à QR4, une seule phrase chacune, et chaque chapitre du mémoire répond à l'une d'elles. Si le jury ne retient qu'une phrase : peut-on protéger le trafic critique sans perdre de débit, et à quel prix en ariary.</w:t>
+      </w:r>
+    </w:p>
+    <w:p>
+      <w:pPr>
+        <w:spacing w:after="140" w:before="240" w:line="360"/>
+      </w:pPr>
+      <w:r>
+        <w:rPr>
+          <w:rFonts w:ascii="Times New Roman" w:cs="Times New Roman" w:eastAsia="Times New Roman" w:hAnsi="Times New Roman"/>
+          <w:b/>
+          <w:bCs/>
+          <w:sz w:val="26"/>
+          <w:szCs w:val="26"/>
+        </w:rPr>
+        <w:t xml:space="preserve">Quelle est ta contribution originale ?</w:t>
+      </w:r>
+    </w:p>
+    <w:p>
+      <w:pPr>
+        <w:spacing w:after="120" w:line="360"/>
+        <w:ind w:firstLine="709"/>
+        <w:jc w:val="both"/>
+      </w:pPr>
+      <w:r>
+        <w:rPr>
+          <w:rFonts w:ascii="Times New Roman" w:cs="Times New Roman" w:eastAsia="Times New Roman" w:hAnsi="Times New Roman"/>
+          <w:b w:val="false"/>
+          <w:bCs w:val="false"/>
+          <w:i w:val="false"/>
+          <w:iCs w:val="false"/>
+          <w:sz w:val="24"/>
+          <w:szCs w:val="24"/>
+        </w:rPr>
+        <w:t xml:space="preserve">Pas une théorie : une preuve locale qui n'existait nulle part. Personne n'avait mesuré, sur des profils représentatifs des liens malgaches prépayés, ce que la charge fait au trafic critique, ni converti ce gaspillage en ariary au palier réel. L'apport tient en trois objets : le premier jeu de mesures comparatives du domaine sur ce terrain, la métrique budgétaire qui parle à la direction, et l'instrument reproductible qui permet à l'institution de refaire la mesure sans l'auteur. Un master n'a pas à révolutionner son champ : il doit produire un fait neuf, vérifiable, utile.</w:t>
+      </w:r>
+    </w:p>
+    <w:p>
+      <w:pPr>
+        <w:spacing w:after="140" w:before="240" w:line="360"/>
+      </w:pPr>
+      <w:r>
+        <w:rPr>
+          <w:rFonts w:ascii="Times New Roman" w:cs="Times New Roman" w:eastAsia="Times New Roman" w:hAnsi="Times New Roman"/>
+          <w:b/>
+          <w:bCs/>
+          <w:sz w:val="26"/>
+          <w:szCs w:val="26"/>
+        </w:rPr>
+        <w:t xml:space="preserve">À quoi ça sert, dans l'entreprise ? Qu'est-ce que ça apporte ?</w:t>
+      </w:r>
+    </w:p>
+    <w:p>
+      <w:pPr>
+        <w:spacing w:after="120" w:line="360"/>
+        <w:ind w:firstLine="709"/>
+        <w:jc w:val="both"/>
+      </w:pPr>
+      <w:r>
+        <w:rPr>
+          <w:rFonts w:ascii="Times New Roman" w:cs="Times New Roman" w:eastAsia="Times New Roman" w:hAnsi="Times New Roman"/>
+          <w:b w:val="false"/>
+          <w:bCs w:val="false"/>
+          <w:i w:val="false"/>
+          <w:iCs w:val="false"/>
+          <w:sz w:val="24"/>
+          <w:szCs w:val="24"/>
+        </w:rPr>
+        <w:t xml:space="preserve">À décider sans deviner. Aujourd'hui, configurer un routeur de site, c'est appliquer une recette trouvée en ligne et espérer. Avec cet instrument, la direction sait, pour chaque classe de lien, quel réglage protège les alertes et combien coûte le gaspillage évité — en ariary, au forfait souscrit. Ce que ça apporte : des décisions de configuration justifiées par des mesures locales au lieu d'intuitions, un chiffrage budgétaire du gaspillage, et une sentinelle qui surveille les liens après configuration. Le mémoire ne vend pas un réglage ; il vend la fin des réglages à l'aveugle.</w:t>
+      </w:r>
+    </w:p>
+    <w:p>
+      <w:pPr>
+        <w:spacing w:after="140" w:before="240" w:line="360"/>
+      </w:pPr>
+      <w:r>
+        <w:rPr>
+          <w:rFonts w:ascii="Times New Roman" w:cs="Times New Roman" w:eastAsia="Times New Roman" w:hAnsi="Times New Roman"/>
+          <w:b/>
+          <w:bCs/>
+          <w:sz w:val="26"/>
+          <w:szCs w:val="26"/>
+        </w:rPr>
+        <w:t xml:space="preserve">Concrètement, comment les gens vont l'utiliser ?</w:t>
+      </w:r>
+    </w:p>
+    <w:p>
+      <w:pPr>
+        <w:spacing w:after="120" w:line="360"/>
+        <w:ind w:firstLine="709"/>
+        <w:jc w:val="both"/>
+      </w:pPr>
+      <w:r>
+        <w:rPr>
+          <w:rFonts w:ascii="Times New Roman" w:cs="Times New Roman" w:eastAsia="Times New Roman" w:hAnsi="Times New Roman"/>
+          <w:b w:val="false"/>
+          <w:bCs w:val="false"/>
+          <w:i w:val="false"/>
+          <w:iCs w:val="false"/>
+          <w:sz w:val="24"/>
+          <w:szCs w:val="24"/>
+        </w:rPr>
+        <w:t xml:space="preserve">Trois usages, trois personnes. Le technicien du site cellulaire le plus chargé lance un audit de trente secondes, lit la note de santé du lien, applique la ligne de configuration prescrite pendant une fenêtre de maintenance, et re-mesure : avant, après, écart, verdict. L'agent régional sans navigateur pilote tout depuis le terminal, mêmes valeurs, mêmes commandes. La direction reçoit le constat signé, deux pages, avec l'empreinte de preuve : elle approuve une dépense ou un changement en lisant un écart mesuré, pas une promesse. Aucun usage n'exige de comprendre le banc : l'outil demande le lien, rend un verdict.</w:t>
+      </w:r>
+    </w:p>
+    <w:p>
+      <w:pPr>
+        <w:spacing w:after="140" w:before="240" w:line="360"/>
+      </w:pPr>
+      <w:r>
+        <w:rPr>
+          <w:rFonts w:ascii="Times New Roman" w:cs="Times New Roman" w:eastAsia="Times New Roman" w:hAnsi="Times New Roman"/>
+          <w:b/>
+          <w:bCs/>
+          <w:sz w:val="26"/>
+          <w:szCs w:val="26"/>
+        </w:rPr>
+        <w:t xml:space="preserve">Ton projet est-il réel, ou juste une maquette de recherche ?</w:t>
+      </w:r>
+    </w:p>
+    <w:p>
+      <w:pPr>
+        <w:spacing w:after="120" w:line="360"/>
+        <w:ind w:firstLine="709"/>
+        <w:jc w:val="both"/>
+      </w:pPr>
+      <w:r>
+        <w:rPr>
+          <w:rFonts w:ascii="Times New Roman" w:cs="Times New Roman" w:eastAsia="Times New Roman" w:hAnsi="Times New Roman"/>
+          <w:b w:val="false"/>
+          <w:bCs w:val="false"/>
+          <w:i w:val="false"/>
+          <w:iCs w:val="false"/>
+          <w:sz w:val="24"/>
+          <w:szCs w:val="24"/>
+        </w:rPr>
+        <w:t xml:space="preserve">Réel, et démontrable de quatre façons qui ne sont pas le hash. Un : l'audit tourne sur n'importe quel lien réel depuis n'importe quel poste, sans droits admin — le jury peut le lancer sur son propre téléphone partagé en cinq minutes. Deux : le banc rejoue un run gelé et réaffiche les mêmes chiffres, preuve que la mesure n'est pas un coup de chance. Trois : chaque figure du mémoire se régénère depuis les archives en une commande, sans toucher un chiffre à la main. Quatre : la recette tc exportée s'applique sur un routeur Linux et la re-mesure montre l'écart. Le hash ne prouve que l'intégrité des fichiers ; la réalité du projet se prouve en le faisant tourner devant le jury.</w:t>
+      </w:r>
+    </w:p>
+    <w:p>
+      <w:pPr>
+        <w:spacing w:after="140" w:before="240" w:line="360"/>
+      </w:pPr>
+      <w:r>
+        <w:rPr>
+          <w:rFonts w:ascii="Times New Roman" w:cs="Times New Roman" w:eastAsia="Times New Roman" w:hAnsi="Times New Roman"/>
+          <w:b/>
+          <w:bCs/>
+          <w:sz w:val="26"/>
+          <w:szCs w:val="26"/>
+        </w:rPr>
+        <w:t xml:space="preserve">Pourquoi pas pfSense ou OPNsense, qui savent déjà façonner ?</w:t>
+      </w:r>
+    </w:p>
+    <w:p>
+      <w:pPr>
+        <w:spacing w:after="120" w:line="360"/>
+        <w:ind w:firstLine="709"/>
+        <w:jc w:val="both"/>
+      </w:pPr>
+      <w:r>
+        <w:rPr>
+          <w:rFonts w:ascii="Times New Roman" w:cs="Times New Roman" w:eastAsia="Times New Roman" w:hAnsi="Times New Roman"/>
+          <w:b w:val="false"/>
+          <w:bCs w:val="false"/>
+          <w:i w:val="false"/>
+          <w:iCs w:val="false"/>
+          <w:sz w:val="24"/>
+          <w:szCs w:val="24"/>
+        </w:rPr>
+        <w:t xml:space="preserve">Bonne objection, mauvaise opposition : pfSense exécute, cet instrument prouve quoi exécuter. Un pare-feu avec limiteur sait appliquer une file, mais il ne dit pas laquelle protège les alertes sur un lien 4G à 0,5 % de perte, ne compare pas les réglages à conditions identiques, n'archive pas de preuve rejouable et ne chiffre rien en ariary. La réponse honnête au jury : une fois la mesure faite ici, la prescription s'applique très bien sur pfSense, MikroTik ou Linux nu — le mémoire donne même la traduction matérielle. L'instrument n'est pas un concurrent du pare-feu, c'est le laboratoire qui justifie son réglage.</w:t>
+      </w:r>
+    </w:p>
+    <w:p>
+      <w:pPr>
+        <w:spacing w:after="140" w:before="240" w:line="360"/>
+      </w:pPr>
+      <w:r>
+        <w:rPr>
+          <w:rFonts w:ascii="Times New Roman" w:cs="Times New Roman" w:eastAsia="Times New Roman" w:hAnsi="Times New Roman"/>
+          <w:b/>
+          <w:bCs/>
+          <w:sz w:val="26"/>
+          <w:szCs w:val="26"/>
+        </w:rPr>
+        <w:t xml:space="preserve">Tu avais trois questions de recherche : quel est le verdict final du projet ?</w:t>
+      </w:r>
+    </w:p>
+    <w:p>
+      <w:pPr>
+        <w:spacing w:after="120" w:line="360"/>
+        <w:ind w:firstLine="709"/>
+        <w:jc w:val="both"/>
+      </w:pPr>
+      <w:r>
+        <w:rPr>
+          <w:rFonts w:ascii="Times New Roman" w:cs="Times New Roman" w:eastAsia="Times New Roman" w:hAnsi="Times New Roman"/>
+          <w:b w:val="false"/>
+          <w:bCs w:val="false"/>
+          <w:i w:val="false"/>
+          <w:iCs w:val="false"/>
+          <w:sz w:val="24"/>
+          <w:szCs w:val="24"/>
+        </w:rPr>
+        <w:t xml:space="preserve">Question un, l'effet de la discipline : prouvé et massif — sur lien cellulaire chargé, la file simple ne sauve qu'à peine trois requêtes critiques sur cinq quand les disciplines actives en sauvent la quasi-totalité, débit préservé. Question deux, l'interaction avec l'émetteur : l'émetteur décide autant que la file — BBR remplit la file simple jusqu'au plafond pendant que CUBIC s'effondre sur la perte de base du lien ; il n'y a pas de bon réglage sans choisir les deux leviers ensemble. Question trois, la robustesse : l'avantage tient sur la fibre et l'orbite basse, s'effondre avec le lien sur le satellite géostationnaire où la physique interdit toute fenêtre utile. Verdict opérationnel : discipline active partout sauf là où la physique l'interdit, capacité calée sous la capacité mesurée, et re-mesure après chaque changement.</w:t>
+      </w:r>
+    </w:p>
+    <w:p>
+      <w:pPr>
+        <w:spacing w:after="140" w:before="240" w:line="360"/>
+      </w:pPr>
+      <w:r>
+        <w:rPr>
+          <w:rFonts w:ascii="Times New Roman" w:cs="Times New Roman" w:eastAsia="Times New Roman" w:hAnsi="Times New Roman"/>
+          <w:b/>
+          <w:bCs/>
+          <w:sz w:val="26"/>
+          <w:szCs w:val="26"/>
+        </w:rPr>
         <w:t xml:space="preserve">D'où viennent vos données ?</w:t>
       </w:r>
     </w:p>
@@ -1083,7 +1423,7 @@
           <w:sz w:val="24"/>
           <w:szCs w:val="24"/>
         </w:rPr>
-        <w:t xml:space="preserve">Les 153 runs sont horodatés par leur identifiant même : run-1788191429 commence par un horodatage Unix. La machine du banc : machine virtuelle Ubuntu, deux processeurs virtuels, et chaque événement porte sa colonne d'utilisation processeur, zéro pour cent sur les six événements du run final : la machine n'a pas influé. Réinstaller le banc et relancer la même campagne redonnerait des conditions identiques, c'est l'objet du banc.</w:t>
+        <w:t xml:space="preserve">Les 153 runs sont horodatés par leur identifiant même : run-1788191429 commence par un horodatage Unix. La machine du banc : serveur physique hébergé à Météo Madagascar, sous Ubuntu Server, et chaque événement porte sa colonne d'utilisation processeur, zéro pour cent sur les six événements du run final : la machine n'a pas influé. Réinstaller le banc et relancer la même campagne redonnerait des conditions identiques, c'est l'objet du banc.</w:t>
       </w:r>
     </w:p>
     <w:p>
@@ -1302,7 +1642,7 @@
           <w:sz w:val="26"/>
           <w:szCs w:val="26"/>
         </w:rPr>
-        <w:t xml:space="preserve">Votre p95, sans barre d'erreur : 40 et 55 millisecondes, est-ce différent ?</w:t>
+        <w:t xml:space="preserve">Votre p95, sans barre d'erreur : 60 et 763 millisecondes, est-ce différent ?</w:t>
       </w:r>
     </w:p>
     <w:p>
@@ -1559,7 +1899,7 @@
           <w:sz w:val="24"/>
           <w:szCs w:val="24"/>
         </w:rPr>
-        <w:t xml:space="preserve">La conception de la mesure a précédé le développement : le protocole, les portes et les indicateurs d'abord, l'instrument ensuite. Le résultat : un binaire unique de treize mégaoctets, sans dépendance d'exécution, avec ses tests par paquet, un assistant d'installation en sept étapes et dix-huit commandes de déploiement et de contrôle.</w:t>
+        <w:t xml:space="preserve">La conception de la mesure a précédé le développement : le protocole, les portes et les indicateurs d'abord, l'instrument ensuite. Le résultat : un binaire unique, sans dépendance d'exécution, avec ses tests par paquet, un assistant d'installation en sept étapes et dix-huit commandes de déploiement et de contrôle.</w:t>
       </w:r>
     </w:p>
     <w:p>
@@ -1798,6 +2138,142 @@
           <w:szCs w:val="24"/>
         </w:rPr>
         <w:t xml:space="preserve">Une campagne répétée, trois répétitions systématiques par cellule, qui montrerait l'écart d'échéance soixante contre quatre-vingt-dix-huit pour cent se refermer ou s'inverser sur le profil cellulaire. L'écart actuel est massif et cohérent avec la mécanique des files : mais la réponse exacte est celle-ci, la falsification possible est nommée, et la première perspective la met à l'épreuve.</w:t>
+      </w:r>
+    </w:p>
+    <w:p>
+      <w:pPr>
+        <w:spacing w:after="140" w:before="240" w:line="360"/>
+      </w:pPr>
+      <w:r>
+        <w:rPr>
+          <w:rFonts w:ascii="Times New Roman" w:cs="Times New Roman" w:eastAsia="Times New Roman" w:hAnsi="Times New Roman"/>
+          <w:b/>
+          <w:bCs/>
+          <w:sz w:val="26"/>
+          <w:szCs w:val="26"/>
+        </w:rPr>
+        <w:t xml:space="preserve">Quelle est la principale limite de ton travail ?</w:t>
+      </w:r>
+    </w:p>
+    <w:p>
+      <w:pPr>
+        <w:spacing w:after="120" w:line="360"/>
+        <w:ind w:firstLine="709"/>
+        <w:jc w:val="both"/>
+      </w:pPr>
+      <w:r>
+        <w:rPr>
+          <w:rFonts w:ascii="Times New Roman" w:cs="Times New Roman" w:eastAsia="Times New Roman" w:hAnsi="Times New Roman"/>
+          <w:b w:val="false"/>
+          <w:bCs w:val="false"/>
+          <w:i w:val="false"/>
+          <w:iCs w:val="false"/>
+          <w:sz w:val="24"/>
+          <w:szCs w:val="24"/>
+        </w:rPr>
+        <w:t xml:space="preserve">La question la plus posée en jury, toutes filières confondues, et le piège est de répondre une limite cosmétique. La vraie : les campagnes finales ne conduisent qu'une répétition par cellule — cela interdit les comparaisons fines entre disciplines voisines, pas les ordres de grandeur massifs. Ce que ça change : les conclusions sur les cellules à événement unique sont exploratoires. Ce qui est fait malgré elle : seize, douze et douze répétitions sur les vagues antérieures du profil cellulaire, cinquante-cinq sur la fibre, et trois répétitions systématiques en première perspective. Nommer, borner, mitiger : le jury hoche la tête.</w:t>
+      </w:r>
+    </w:p>
+    <w:p>
+      <w:pPr>
+        <w:spacing w:after="140" w:before="240" w:line="360"/>
+      </w:pPr>
+      <w:r>
+        <w:rPr>
+          <w:rFonts w:ascii="Times New Roman" w:cs="Times New Roman" w:eastAsia="Times New Roman" w:hAnsi="Times New Roman"/>
+          <w:b/>
+          <w:bCs/>
+          <w:sz w:val="26"/>
+          <w:szCs w:val="26"/>
+        </w:rPr>
+        <w:t xml:space="preserve">Si tu refaisais ce mémoire aujourd'hui, que changerais-tu ?</w:t>
+      </w:r>
+    </w:p>
+    <w:p>
+      <w:pPr>
+        <w:spacing w:after="120" w:line="360"/>
+        <w:ind w:firstLine="709"/>
+        <w:jc w:val="both"/>
+      </w:pPr>
+      <w:r>
+        <w:rPr>
+          <w:rFonts w:ascii="Times New Roman" w:cs="Times New Roman" w:eastAsia="Times New Roman" w:hAnsi="Times New Roman"/>
+          <w:b w:val="false"/>
+          <w:bCs w:val="false"/>
+          <w:i w:val="false"/>
+          <w:iCs w:val="false"/>
+          <w:sz w:val="24"/>
+          <w:szCs w:val="24"/>
+        </w:rPr>
+        <w:t xml:space="preserve">Question piège déguisée en question gentille : « rien » passe pour de l'aveuglement, tout démolir pour une disqualification. Un seul changement précis, motivé par ce qui a été appris en route : instrumenter le multi-flux dès le début plutôt qu'en fin de travail — l'équité inter-flux serait mesurée sur toutes les cellules au lieu d'une partie, et la première limite tomberait avec la seconde. Le jury vérifie que la démarche scientifique a été intégrée, pas que le travail était parfait du premier coup.</w:t>
+      </w:r>
+    </w:p>
+    <w:p>
+      <w:pPr>
+        <w:spacing w:after="140" w:before="240" w:line="360"/>
+      </w:pPr>
+      <w:r>
+        <w:rPr>
+          <w:rFonts w:ascii="Times New Roman" w:cs="Times New Roman" w:eastAsia="Times New Roman" w:hAnsi="Times New Roman"/>
+          <w:b/>
+          <w:bCs/>
+          <w:sz w:val="26"/>
+          <w:szCs w:val="26"/>
+        </w:rPr>
+        <w:t xml:space="preserve">Définis précisément ton concept central.</w:t>
+      </w:r>
+    </w:p>
+    <w:p>
+      <w:pPr>
+        <w:spacing w:after="120" w:line="360"/>
+        <w:ind w:firstLine="709"/>
+        <w:jc w:val="both"/>
+      </w:pPr>
+      <w:r>
+        <w:rPr>
+          <w:rFonts w:ascii="Times New Roman" w:cs="Times New Roman" w:eastAsia="Times New Roman" w:hAnsi="Times New Roman"/>
+          <w:b w:val="false"/>
+          <w:bCs w:val="false"/>
+          <w:i w:val="false"/>
+          <w:iCs w:val="false"/>
+          <w:sz w:val="24"/>
+          <w:szCs w:val="24"/>
+        </w:rPr>
+        <w:t xml:space="preserve">Le bufferbloat : la dégradation du temps de réponse causée par l'accumulation persistante de paquets dans des files d'attente surdimensionnées, sans perte visible ni baisse de débit — d'après Gettys et les auteurs du domaine, RFC 8290. L'opérationnalisation dans ce mémoire : l'écart entre la latence des petites requêtes au repos et sous charge saturante, mesuré en millisecondes, avec une échéance qui en fait un engagement vérifiable. Un concept bien défini se mesure ; celui-ci se mesure en trois fenêtres de trente, cent vingt et trente secondes.</w:t>
+      </w:r>
+    </w:p>
+    <w:p>
+      <w:pPr>
+        <w:spacing w:after="140" w:before="240" w:line="360"/>
+      </w:pPr>
+      <w:r>
+        <w:rPr>
+          <w:rFonts w:ascii="Times New Roman" w:cs="Times New Roman" w:eastAsia="Times New Roman" w:hAnsi="Times New Roman"/>
+          <w:b/>
+          <w:bCs/>
+          <w:sz w:val="26"/>
+          <w:szCs w:val="26"/>
+        </w:rPr>
+        <w:t xml:space="preserve">Y a-t-il des auteurs ou des outils importants que tu n'as pas cités ?</w:t>
+      </w:r>
+    </w:p>
+    <w:p>
+      <w:pPr>
+        <w:spacing w:after="120" w:line="360"/>
+        <w:ind w:firstLine="709"/>
+        <w:jc w:val="both"/>
+      </w:pPr>
+      <w:r>
+        <w:rPr>
+          <w:rFonts w:ascii="Times New Roman" w:cs="Times New Roman" w:eastAsia="Times New Roman" w:hAnsi="Times New Roman"/>
+          <w:b w:val="false"/>
+          <w:bCs w:val="false"/>
+          <w:i w:val="false"/>
+          <w:iCs w:val="false"/>
+          <w:sz w:val="24"/>
+          <w:szCs w:val="24"/>
+        </w:rPr>
+        <w:t xml:space="preserve">Honnêteté d'abord : la revue couvre les disciplines de file (RFC 8290, RFC 7928, RFC 8033), la mesure sous charge (Flent), la note grand public (Waveform) et le précédent réglementaire (FCC). Ce qui n'y est pas : la gestion de file programmable (eBPF, XDP), la qualité de service Wi-Fi (WMM) et les ordonnanceurs radio des opérateurs — trois couches réelles qui influencent les liens mesurés sans être modélisées. Critère d'inclusion appliqué : ce que l'institution peut configurer sur ses équipements. Le reste est nommé en perspective, pas caché.</w:t>
       </w:r>
     </w:p>
     <w:p>

</xml_diff>